<commit_message>
Documentos firmados formatos 1-4
</commit_message>
<xml_diff>
--- a/Entregables/L00418806_Manobanda_Formato 5 Evaluación tutor académico.docx
+++ b/Entregables/L00418806_Manobanda_Formato 5 Evaluación tutor académico.docx
@@ -2023,6 +2023,15 @@
                 <w:szCs w:val="18"/>
               </w:rPr>
             </w:pPr>
+            <w:r>
+              <w:rPr>
+                <w:rFonts w:ascii="Times New Roman" w:hAnsi="Times New Roman"/>
+                <w:i/>
+                <w:sz w:val="18"/>
+                <w:szCs w:val="18"/>
+              </w:rPr>
+              <w:t>9</w:t>
+            </w:r>
           </w:p>
         </w:tc>
       </w:tr>
@@ -2182,6 +2191,15 @@
                 <w:szCs w:val="18"/>
               </w:rPr>
             </w:pPr>
+            <w:r>
+              <w:rPr>
+                <w:rFonts w:ascii="Times New Roman" w:hAnsi="Times New Roman"/>
+                <w:i/>
+                <w:sz w:val="18"/>
+                <w:szCs w:val="18"/>
+              </w:rPr>
+              <w:t>9</w:t>
+            </w:r>
           </w:p>
         </w:tc>
       </w:tr>
@@ -2234,6 +2252,15 @@
                 <w:szCs w:val="18"/>
               </w:rPr>
             </w:pPr>
+            <w:r>
+              <w:rPr>
+                <w:rFonts w:ascii="Times New Roman" w:hAnsi="Times New Roman"/>
+                <w:i/>
+                <w:sz w:val="18"/>
+                <w:szCs w:val="18"/>
+              </w:rPr>
+              <w:t>18</w:t>
+            </w:r>
           </w:p>
         </w:tc>
       </w:tr>
@@ -2634,13 +2661,20 @@
           <w:p>
             <w:pPr>
               <w:ind w:left="360"/>
-              <w:jc w:val="center"/>
               <w:rPr>
                 <w:sz w:val="18"/>
                 <w:szCs w:val="18"/>
                 <w:lang w:val="es-MX"/>
               </w:rPr>
             </w:pPr>
+            <w:r>
+              <w:rPr>
+                <w:sz w:val="18"/>
+                <w:szCs w:val="18"/>
+                <w:lang w:val="es-MX"/>
+              </w:rPr>
+              <w:t xml:space="preserve">                12</w:t>
+            </w:r>
           </w:p>
         </w:tc>
       </w:tr>
@@ -2782,13 +2816,20 @@
           <w:p>
             <w:pPr>
               <w:ind w:left="360"/>
-              <w:jc w:val="center"/>
               <w:rPr>
                 <w:sz w:val="18"/>
                 <w:szCs w:val="18"/>
                 <w:lang w:val="es-MX"/>
               </w:rPr>
             </w:pPr>
+            <w:r>
+              <w:rPr>
+                <w:sz w:val="18"/>
+                <w:szCs w:val="18"/>
+                <w:lang w:val="es-MX"/>
+              </w:rPr>
+              <w:t xml:space="preserve">                7.2</w:t>
+            </w:r>
           </w:p>
         </w:tc>
       </w:tr>
@@ -2845,11 +2886,20 @@
               <w:jc w:val="center"/>
               <w:rPr>
                 <w:rFonts w:ascii="Times New Roman" w:hAnsi="Times New Roman"/>
-                <w:b/>
+                <w:bCs/>
                 <w:sz w:val="18"/>
                 <w:szCs w:val="18"/>
               </w:rPr>
             </w:pPr>
+            <w:r>
+              <w:rPr>
+                <w:rFonts w:ascii="Times New Roman" w:hAnsi="Times New Roman"/>
+                <w:bCs/>
+                <w:sz w:val="18"/>
+                <w:szCs w:val="18"/>
+              </w:rPr>
+              <w:t>19.2</w:t>
+            </w:r>
           </w:p>
         </w:tc>
       </w:tr>
@@ -2930,10 +2980,9 @@
         <w:jc w:val="left"/>
         <w:rPr>
           <w:rFonts w:ascii="Times New Roman" w:hAnsi="Times New Roman"/>
-          <w:b/>
-          <w:sz w:val="18"/>
-          <w:szCs w:val="18"/>
-          <w:u w:val="single"/>
+          <w:bCs/>
+          <w:sz w:val="20"/>
+          <w:szCs w:val="20"/>
         </w:rPr>
       </w:pPr>
     </w:p>
@@ -3552,7 +3601,7 @@
           <w:szCs w:val="20"/>
         </w:rPr>
         <w:pict w14:anchorId="652C361B">
-          <v:line id="9 Conector recto" o:spid="_x0000_s1026" style="position:absolute;z-index:251720704;visibility:visible;mso-wrap-distance-top:-6e-5mm;mso-wrap-distance-bottom:-6e-5mm" from="36.45pt,9.3pt" to="171.25pt,9.3pt" o:gfxdata="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" strokecolor="black [3040]">
+          <v:line id="9 Conector recto" o:spid="_x0000_s1026" style="position:absolute;z-index:251720704;visibility:visible;mso-wrap-distance-top:-6e-5mm;mso-wrap-distance-bottom:-6e-5mm" from="9.45pt,9.3pt" to="171.25pt,9.3pt" o:gfxdata="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" strokecolor="black [3040]">
             <o:lock v:ext="edit" shapetype="f"/>
           </v:line>
         </w:pict>
@@ -3747,6 +3796,13 @@
             <o:lock v:ext="edit" shapetype="f"/>
           </v:line>
         </w:pict>
+      </w:r>
+      <w:r>
+        <w:rPr>
+          <w:sz w:val="20"/>
+          <w:szCs w:val="20"/>
+        </w:rPr>
+        <w:tab/>
       </w:r>
     </w:p>
     <w:sectPr>

</xml_diff>